<commit_message>
added screenshot to docx
</commit_message>
<xml_diff>
--- a/module-1/Herrick_Mod1-2.docx
+++ b/module-1/Herrick_Mod1-2.docx
@@ -19,6 +19,9 @@
     </w:p>
     <w:p>
       <w:r>
+        <w:rPr>
+          <w:noProof/>
+        </w:rPr>
         <w:drawing>
           <wp:inline distT="0" distB="0" distL="0" distR="0" wp14:anchorId="3A529E37" wp14:editId="0E8C8205">
             <wp:extent cx="4525006" cy="1857634"/>
@@ -56,7 +59,45 @@
         </w:drawing>
       </w:r>
     </w:p>
-    <w:p/>
+    <w:p>
+      <w:r>
+        <w:drawing>
+          <wp:inline distT="0" distB="0" distL="0" distR="0" wp14:anchorId="5B13340D" wp14:editId="39CD7CF0">
+            <wp:extent cx="5943600" cy="3492500"/>
+            <wp:effectExtent l="0" t="0" r="0" b="0"/>
+            <wp:docPr id="329687379" name="Picture 1"/>
+            <wp:cNvGraphicFramePr>
+              <a:graphicFrameLocks xmlns:a="http://schemas.openxmlformats.org/drawingml/2006/main" noChangeAspect="1"/>
+            </wp:cNvGraphicFramePr>
+            <a:graphic xmlns:a="http://schemas.openxmlformats.org/drawingml/2006/main">
+              <a:graphicData uri="http://schemas.openxmlformats.org/drawingml/2006/picture">
+                <pic:pic xmlns:pic="http://schemas.openxmlformats.org/drawingml/2006/picture">
+                  <pic:nvPicPr>
+                    <pic:cNvPr id="329687379" name=""/>
+                    <pic:cNvPicPr/>
+                  </pic:nvPicPr>
+                  <pic:blipFill>
+                    <a:blip r:embed="rId5"/>
+                    <a:stretch>
+                      <a:fillRect/>
+                    </a:stretch>
+                  </pic:blipFill>
+                  <pic:spPr>
+                    <a:xfrm>
+                      <a:off x="0" y="0"/>
+                      <a:ext cx="5943600" cy="3492500"/>
+                    </a:xfrm>
+                    <a:prstGeom prst="rect">
+                      <a:avLst/>
+                    </a:prstGeom>
+                  </pic:spPr>
+                </pic:pic>
+              </a:graphicData>
+            </a:graphic>
+          </wp:inline>
+        </w:drawing>
+      </w:r>
+    </w:p>
     <w:p/>
     <w:sectPr>
       <w:pgSz w:w="12240" w:h="15840"/>

</xml_diff>

<commit_message>
Finalize Module 1.2 assignment
</commit_message>
<xml_diff>
--- a/module-1/Herrick_Mod1-2.docx
+++ b/module-1/Herrick_Mod1-2.docx
@@ -17,6 +17,18 @@
         <w:t>CSD-325 Module 1.2</w:t>
       </w:r>
     </w:p>
+    <w:p/>
+    <w:p>
+      <w:r>
+        <w:t>Git URL:</w:t>
+      </w:r>
+    </w:p>
+    <w:p>
+      <w:r>
+        <w:t>https://github.com/JammytheDM/csd-325</w:t>
+      </w:r>
+    </w:p>
+    <w:p/>
     <w:p>
       <w:r>
         <w:rPr>
@@ -61,6 +73,9 @@
     </w:p>
     <w:p>
       <w:r>
+        <w:rPr>
+          <w:noProof/>
+        </w:rPr>
         <w:drawing>
           <wp:inline distT="0" distB="0" distL="0" distR="0" wp14:anchorId="5B13340D" wp14:editId="39CD7CF0">
             <wp:extent cx="5943600" cy="3492500"/>

</xml_diff>